<commit_message>
Add Claude-Code-style multi-agent difficulty-router example
model-hub/examples/claude_code_agent.rs: a coding-assistant demo where a
main orchestrator (DifficultyRouter) classifies each task and delegates by
difficulty across two engines:
  - Simple  -> NeedleOrchestrator (deterministic tool calls, no LLM)
  - Moderate-> Orchestrator w/ Needle routing + LLM composition
  - Complex -> Orchestrator w/ full LLM routing + composition
Local model is selectable: offline StubTextModel by default, or a real GGUF
quantized Llama via GRAPHDB_MODEL / GRAPHDB_TOKENIZER env vars. Runs CPU-only
offline with no downloads. EXAMPLES.md/pdf/docx updated with run command.
</commit_message>
<xml_diff>
--- a/EXAMPLES.docx
+++ b/EXAMPLES.docx
@@ -335,6 +335,45 @@
           <w:rStyle w:val="NormalTok"/>
         </w:rPr>
         <w:t xml:space="preserve"> image_segmentation</w:t>
+      </w:r>
+      <w:r>
+        <w:br/>
+      </w:r>
+      <w:r>
+        <w:rPr>
+          <w:rStyle w:val="ExtensionTok"/>
+        </w:rPr>
+        <w:t xml:space="preserve">cargo</w:t>
+      </w:r>
+      <w:r>
+        <w:rPr>
+          <w:rStyle w:val="NormalTok"/>
+        </w:rPr>
+        <w:t xml:space="preserve"> run </w:t>
+      </w:r>
+      <w:r>
+        <w:rPr>
+          <w:rStyle w:val="AttributeTok"/>
+        </w:rPr>
+        <w:t xml:space="preserve">-p</w:t>
+      </w:r>
+      <w:r>
+        <w:rPr>
+          <w:rStyle w:val="NormalTok"/>
+        </w:rPr>
+        <w:t xml:space="preserve"> model-hub  </w:t>
+      </w:r>
+      <w:r>
+        <w:rPr>
+          <w:rStyle w:val="AttributeTok"/>
+        </w:rPr>
+        <w:t xml:space="preserve">--example</w:t>
+      </w:r>
+      <w:r>
+        <w:rPr>
+          <w:rStyle w:val="NormalTok"/>
+        </w:rPr>
+        <w:t xml:space="preserve"> claude_code_agent</w:t>
       </w:r>
       <w:r>
         <w:br/>

</xml_diff>

<commit_message>
Add skills + explicit tool-calling loop to claude_code_agent example
Extends the multi-agent difficulty-router demo to mirror Claude Code more
closely:

- Skills: on-disk instruction folders (examples/skills/<name>/SKILL.md) with
  frontmatter (name/description/cues) + instruction body. SkillRegistry
  discovers them at runtime, selects the best match per task by cue score, and
  injects the instructions into the LLM prompt. Built-in fallback set included.
  Four skills shipped: codebase-navigator, code-explainer, refactor-planner,
  api-comparator.
- Tool calling: an explicit, visible tool-use loop (run_agent) over
  graphdb_tool_schemas via select_tool + ToolExecutor, printing tool_use /
  tool_result traces each turn. Simple tier formats results deterministically
  (no LLM); Moderate/Complex compose with the LLM using the injected skill.
- EXAMPLES.md: new section 8 + index row documenting the design.

Builds clean and runs fully offline (CPU-only, no downloads).
</commit_message>
<xml_diff>
--- a/EXAMPLES.docx
+++ b/EXAMPLES.docx
@@ -2,7 +2,7 @@
 <file path=word/document.xml><?xml version="1.0" encoding="utf-8"?>
 <w:document xmlns:w="http://schemas.openxmlformats.org/wordprocessingml/2006/main" xmlns:m="http://schemas.openxmlformats.org/officeDocument/2006/math" xmlns:r="http://schemas.openxmlformats.org/officeDocument/2006/relationships" xmlns:o="urn:schemas-microsoft-com:office:office" xmlns:v="urn:schemas-microsoft-com:vml" xmlns:w10="urn:schemas-microsoft-com:office:word" xmlns:a="http://schemas.openxmlformats.org/drawingml/2006/main" xmlns:pic="http://schemas.openxmlformats.org/drawingml/2006/picture" xmlns:wp="http://schemas.openxmlformats.org/drawingml/2006/wordprocessingDrawing">
   <w:body>
-    <w:bookmarkStart w:id="38" w:name="examples"/>
+    <w:bookmarkStart w:id="41" w:name="examples"/>
     <w:p>
       <w:pPr>
         <w:pStyle w:val="Heading1"/>
@@ -498,7 +498,7 @@
       </w:r>
     </w:p>
     <w:bookmarkEnd w:id="20"/>
-    <w:bookmarkStart w:id="28" w:name="index"/>
+    <w:bookmarkStart w:id="29" w:name="index"/>
     <w:p>
       <w:pPr>
         <w:pStyle w:val="Heading2"/>
@@ -1223,6 +1223,94 @@
           </w:p>
         </w:tc>
       </w:tr>
+      <w:tr>
+        <w:tc>
+          <w:tcPr/>
+          <w:p>
+            <w:pPr>
+              <w:pStyle w:val="Compact"/>
+              <w:jc w:val="left"/>
+            </w:pPr>
+            <w:hyperlink r:id="rId28">
+              <w:r>
+                <w:rPr>
+                  <w:rStyle w:val="VerbatimChar"/>
+                </w:rPr>
+                <w:t xml:space="preserve">claude_code_agent</w:t>
+              </w:r>
+            </w:hyperlink>
+          </w:p>
+        </w:tc>
+        <w:tc>
+          <w:tcPr/>
+          <w:p>
+            <w:pPr>
+              <w:pStyle w:val="Compact"/>
+              <w:jc w:val="left"/>
+            </w:pPr>
+            <w:r>
+              <w:rPr>
+                <w:rStyle w:val="VerbatimChar"/>
+              </w:rPr>
+              <w:t xml:space="preserve">model-hub</w:t>
+            </w:r>
+          </w:p>
+        </w:tc>
+        <w:tc>
+          <w:tcPr/>
+          <w:p>
+            <w:pPr>
+              <w:pStyle w:val="Compact"/>
+              <w:jc w:val="left"/>
+            </w:pPr>
+            <w:r>
+              <w:t xml:space="preserve">Multi-agent coding assistant: difficulty router + skills + tool calling</w:t>
+            </w:r>
+          </w:p>
+        </w:tc>
+        <w:tc>
+          <w:tcPr/>
+          <w:p>
+            <w:pPr>
+              <w:pStyle w:val="Compact"/>
+              <w:jc w:val="left"/>
+            </w:pPr>
+            <w:r>
+              <w:rPr>
+                <w:rStyle w:val="VerbatimChar"/>
+              </w:rPr>
+              <w:t xml:space="preserve">TextModel</w:t>
+            </w:r>
+          </w:p>
+        </w:tc>
+        <w:tc>
+          <w:tcPr/>
+          <w:p>
+            <w:pPr>
+              <w:pStyle w:val="Compact"/>
+              <w:jc w:val="left"/>
+            </w:pPr>
+            <w:r>
+              <w:rPr>
+                <w:rStyle w:val="VerbatimChar"/>
+              </w:rPr>
+              <w:t xml:space="preserve">StubTextModel</w:t>
+            </w:r>
+          </w:p>
+        </w:tc>
+        <w:tc>
+          <w:tcPr/>
+          <w:p>
+            <w:pPr>
+              <w:pStyle w:val="Compact"/>
+              <w:jc w:val="left"/>
+            </w:pPr>
+            <w:r>
+              <w:t xml:space="preserve">quantized Llama (GGUF)</w:t>
+            </w:r>
+          </w:p>
+        </w:tc>
+      </w:tr>
     </w:tbl>
     <w:p>
       <w:r>
@@ -1231,8 +1319,8 @@
         </w:pict>
       </w:r>
     </w:p>
-    <w:bookmarkEnd w:id="28"/>
-    <w:bookmarkStart w:id="30" w:name="graphbackend"/>
+    <w:bookmarkEnd w:id="29"/>
+    <w:bookmarkStart w:id="31" w:name="graphbackend"/>
     <w:p>
       <w:pPr>
         <w:pStyle w:val="Heading2"/>
@@ -1360,7 +1448,7 @@
       <w:r>
         <w:t xml:space="preserve"> </w:t>
       </w:r>
-      <w:hyperlink r:id="rId29">
+      <w:hyperlink r:id="rId30">
         <w:r>
           <w:rPr>
             <w:rStyle w:val="VerbatimChar"/>
@@ -1396,8 +1484,8 @@
         <w:t xml:space="preserve">unchanged because they depend only on the trait.</w:t>
       </w:r>
     </w:p>
-    <w:bookmarkEnd w:id="30"/>
-    <w:bookmarkStart w:id="31" w:name="jepa-world-model"/>
+    <w:bookmarkEnd w:id="31"/>
+    <w:bookmarkStart w:id="32" w:name="jepa-world-model"/>
     <w:p>
       <w:pPr>
         <w:pStyle w:val="Heading2"/>
@@ -1525,8 +1613,8 @@
         <w:t xml:space="preserve">reported loss is illustrative rather than a decreasing curve.</w:t>
       </w:r>
     </w:p>
-    <w:bookmarkEnd w:id="31"/>
-    <w:bookmarkStart w:id="32" w:name="text-recognition-ocr"/>
+    <w:bookmarkEnd w:id="32"/>
+    <w:bookmarkStart w:id="33" w:name="text-recognition-ocr"/>
     <w:p>
       <w:pPr>
         <w:pStyle w:val="Heading2"/>
@@ -1677,8 +1765,8 @@
         <w:t xml:space="preserve">) to turn each detected band into real text.</w:t>
       </w:r>
     </w:p>
-    <w:bookmarkEnd w:id="32"/>
-    <w:bookmarkStart w:id="33" w:name="image-generation"/>
+    <w:bookmarkEnd w:id="33"/>
+    <w:bookmarkStart w:id="34" w:name="image-generation"/>
     <w:p>
       <w:pPr>
         <w:pStyle w:val="Heading2"/>
@@ -1817,8 +1905,8 @@
         <w:t xml:space="preserve">).</w:t>
       </w:r>
     </w:p>
-    <w:bookmarkEnd w:id="33"/>
-    <w:bookmarkStart w:id="34" w:name="transcription-speech-to-text"/>
+    <w:bookmarkEnd w:id="34"/>
+    <w:bookmarkStart w:id="35" w:name="transcription-speech-to-text"/>
     <w:p>
       <w:pPr>
         <w:pStyle w:val="Heading2"/>
@@ -1968,8 +2056,8 @@
         <w:t xml:space="preserve">calls are identical.</w:t>
       </w:r>
     </w:p>
-    <w:bookmarkEnd w:id="34"/>
-    <w:bookmarkStart w:id="35" w:name="web-scraping"/>
+    <w:bookmarkEnd w:id="35"/>
+    <w:bookmarkStart w:id="36" w:name="web-scraping"/>
     <w:p>
       <w:pPr>
         <w:pStyle w:val="Heading2"/>
@@ -2146,8 +2234,8 @@
         <w:t xml:space="preserve">docs).</w:t>
       </w:r>
     </w:p>
-    <w:bookmarkEnd w:id="35"/>
-    <w:bookmarkStart w:id="36" w:name="image-segmentation"/>
+    <w:bookmarkEnd w:id="36"/>
+    <w:bookmarkStart w:id="37" w:name="image-segmentation"/>
     <w:p>
       <w:pPr>
         <w:pStyle w:val="Heading2"/>
@@ -2293,6 +2381,820 @@
       </w:r>
       <w:r>
         <w:t xml:space="preserve">masks.</w:t>
+      </w:r>
+    </w:p>
+    <w:bookmarkEnd w:id="37"/>
+    <w:bookmarkStart w:id="39" w:name="X00fe96fb225e2fc082e99cd2d5b8269cc9a6c80"/>
+    <w:p>
+      <w:pPr>
+        <w:pStyle w:val="Heading2"/>
+      </w:pPr>
+      <w:r>
+        <w:t xml:space="preserve">8. Claude-Code agent (multi-agent + skills + tool calling)</w:t>
+      </w:r>
+    </w:p>
+    <w:p>
+      <w:pPr>
+        <w:pStyle w:val="FirstParagraph"/>
+      </w:pPr>
+      <w:r>
+        <w:t xml:space="preserve">A coding assistant in the spirit of</w:t>
+      </w:r>
+      <w:r>
+        <w:t xml:space="preserve"> </w:t>
+      </w:r>
+      <w:r>
+        <w:rPr>
+          <w:bCs/>
+          <w:b/>
+        </w:rPr>
+        <w:t xml:space="preserve">Claude Code</w:t>
+      </w:r>
+      <w:r>
+        <w:t xml:space="preserve">, grounded in this codebase.</w:t>
+      </w:r>
+      <w:r>
+        <w:t xml:space="preserve"> </w:t>
+      </w:r>
+      <w:r>
+        <w:t xml:space="preserve">It brings together three ideas:</w:t>
+      </w:r>
+    </w:p>
+    <w:p>
+      <w:pPr>
+        <w:numPr>
+          <w:ilvl w:val="0"/>
+          <w:numId w:val="1001"/>
+        </w:numPr>
+      </w:pPr>
+      <w:r>
+        <w:rPr>
+          <w:bCs/>
+          <w:b/>
+        </w:rPr>
+        <w:t xml:space="preserve">A main orchestrator that delegates by difficulty.</w:t>
+      </w:r>
+      <w:r>
+        <w:t xml:space="preserve"> </w:t>
+      </w:r>
+      <w:r>
+        <w:t xml:space="preserve">Each task is classified</w:t>
+      </w:r>
+      <w:r>
+        <w:t xml:space="preserve"> </w:t>
+      </w:r>
+      <w:r>
+        <w:t xml:space="preserve">into</w:t>
+      </w:r>
+      <w:r>
+        <w:t xml:space="preserve"> </w:t>
+      </w:r>
+      <w:r>
+        <w:rPr>
+          <w:rStyle w:val="VerbatimChar"/>
+        </w:rPr>
+        <w:t xml:space="preserve">Simple</w:t>
+      </w:r>
+      <w:r>
+        <w:t xml:space="preserve"> </w:t>
+      </w:r>
+      <w:r>
+        <w:t xml:space="preserve">/</w:t>
+      </w:r>
+      <w:r>
+        <w:t xml:space="preserve"> </w:t>
+      </w:r>
+      <w:r>
+        <w:rPr>
+          <w:rStyle w:val="VerbatimChar"/>
+        </w:rPr>
+        <w:t xml:space="preserve">Moderate</w:t>
+      </w:r>
+      <w:r>
+        <w:t xml:space="preserve"> </w:t>
+      </w:r>
+      <w:r>
+        <w:t xml:space="preserve">/</w:t>
+      </w:r>
+      <w:r>
+        <w:t xml:space="preserve"> </w:t>
+      </w:r>
+      <w:r>
+        <w:rPr>
+          <w:rStyle w:val="VerbatimChar"/>
+        </w:rPr>
+        <w:t xml:space="preserve">Complex</w:t>
+      </w:r>
+      <w:r>
+        <w:t xml:space="preserve"> </w:t>
+      </w:r>
+      <w:r>
+        <w:t xml:space="preserve">and routed across two engines — the</w:t>
+      </w:r>
+      <w:r>
+        <w:t xml:space="preserve"> </w:t>
+      </w:r>
+      <w:r>
+        <w:t xml:space="preserve">deterministic</w:t>
+      </w:r>
+      <w:r>
+        <w:t xml:space="preserve"> </w:t>
+      </w:r>
+      <w:r>
+        <w:rPr>
+          <w:bCs/>
+          <w:b/>
+        </w:rPr>
+        <w:t xml:space="preserve">Needle</w:t>
+      </w:r>
+      <w:r>
+        <w:t xml:space="preserve"> </w:t>
+      </w:r>
+      <w:r>
+        <w:t xml:space="preserve">engine for cheap work and a</w:t>
+      </w:r>
+      <w:r>
+        <w:t xml:space="preserve"> </w:t>
+      </w:r>
+      <w:r>
+        <w:rPr>
+          <w:bCs/>
+          <w:b/>
+        </w:rPr>
+        <w:t xml:space="preserve">local LLM</w:t>
+      </w:r>
+      <w:r>
+        <w:t xml:space="preserve"> </w:t>
+      </w:r>
+      <w:r>
+        <w:t xml:space="preserve">for hard</w:t>
+      </w:r>
+      <w:r>
+        <w:t xml:space="preserve"> </w:t>
+      </w:r>
+      <w:r>
+        <w:t xml:space="preserve">reasoning:</w:t>
+      </w:r>
+    </w:p>
+    <w:tbl>
+      <w:tblPr>
+        <w:tblStyle w:val="Table"/>
+        <w:tblW w:type="auto" w:w="0"/>
+        <w:tblLook w:firstRow="1" w:lastRow="0" w:firstColumn="0" w:lastColumn="0" w:noHBand="0" w:noVBand="0" w:val="0020"/>
+      </w:tblPr>
+      <w:tblGrid>
+        <w:gridCol w:w="1980"/>
+        <w:gridCol w:w="1980"/>
+        <w:gridCol w:w="1980"/>
+        <w:gridCol w:w="1980"/>
+      </w:tblGrid>
+      <w:tr>
+        <w:trPr>
+          <w:tblHeader w:val="true"/>
+        </w:trPr>
+        <w:tc>
+          <w:tcPr/>
+          <w:p>
+            <w:pPr>
+              <w:numPr>
+                <w:ilvl w:val="0"/>
+                <w:numId w:val="1000"/>
+              </w:numPr>
+              <w:pStyle w:val="Compact"/>
+              <w:jc w:val="left"/>
+            </w:pPr>
+            <w:r>
+              <w:t xml:space="preserve">Difficulty</w:t>
+            </w:r>
+          </w:p>
+        </w:tc>
+        <w:tc>
+          <w:tcPr/>
+          <w:p>
+            <w:pPr>
+              <w:numPr>
+                <w:ilvl w:val="0"/>
+                <w:numId w:val="1000"/>
+              </w:numPr>
+              <w:pStyle w:val="Compact"/>
+              <w:jc w:val="left"/>
+            </w:pPr>
+            <w:r>
+              <w:t xml:space="preserve">Route tool with</w:t>
+            </w:r>
+          </w:p>
+        </w:tc>
+        <w:tc>
+          <w:tcPr/>
+          <w:p>
+            <w:pPr>
+              <w:numPr>
+                <w:ilvl w:val="0"/>
+                <w:numId w:val="1000"/>
+              </w:numPr>
+              <w:pStyle w:val="Compact"/>
+              <w:jc w:val="left"/>
+            </w:pPr>
+            <w:r>
+              <w:t xml:space="preserve">Compose answer with</w:t>
+            </w:r>
+          </w:p>
+        </w:tc>
+        <w:tc>
+          <w:tcPr/>
+          <w:p>
+            <w:pPr>
+              <w:numPr>
+                <w:ilvl w:val="0"/>
+                <w:numId w:val="1000"/>
+              </w:numPr>
+              <w:pStyle w:val="Compact"/>
+              <w:jc w:val="left"/>
+            </w:pPr>
+            <w:r>
+              <w:t xml:space="preserve">Skill injected</w:t>
+            </w:r>
+          </w:p>
+        </w:tc>
+      </w:tr>
+      <w:tr>
+        <w:tc>
+          <w:tcPr/>
+          <w:p>
+            <w:pPr>
+              <w:numPr>
+                <w:ilvl w:val="0"/>
+                <w:numId w:val="1000"/>
+              </w:numPr>
+              <w:pStyle w:val="Compact"/>
+              <w:jc w:val="left"/>
+            </w:pPr>
+            <w:r>
+              <w:rPr>
+                <w:rStyle w:val="VerbatimChar"/>
+              </w:rPr>
+              <w:t xml:space="preserve">Simple</w:t>
+            </w:r>
+          </w:p>
+        </w:tc>
+        <w:tc>
+          <w:tcPr/>
+          <w:p>
+            <w:pPr>
+              <w:numPr>
+                <w:ilvl w:val="0"/>
+                <w:numId w:val="1000"/>
+              </w:numPr>
+              <w:pStyle w:val="Compact"/>
+              <w:jc w:val="left"/>
+            </w:pPr>
+            <w:r>
+              <w:t xml:space="preserve">Needle</w:t>
+            </w:r>
+          </w:p>
+        </w:tc>
+        <w:tc>
+          <w:tcPr/>
+          <w:p>
+            <w:pPr>
+              <w:numPr>
+                <w:ilvl w:val="0"/>
+                <w:numId w:val="1000"/>
+              </w:numPr>
+              <w:pStyle w:val="Compact"/>
+              <w:jc w:val="left"/>
+            </w:pPr>
+            <w:r>
+              <w:t xml:space="preserve">deterministic (no LLM)</w:t>
+            </w:r>
+          </w:p>
+        </w:tc>
+        <w:tc>
+          <w:tcPr/>
+          <w:p>
+            <w:pPr>
+              <w:numPr>
+                <w:ilvl w:val="0"/>
+                <w:numId w:val="1000"/>
+              </w:numPr>
+              <w:pStyle w:val="Compact"/>
+              <w:jc w:val="left"/>
+            </w:pPr>
+            <w:r>
+              <w:t xml:space="preserve">no</w:t>
+            </w:r>
+          </w:p>
+        </w:tc>
+      </w:tr>
+      <w:tr>
+        <w:tc>
+          <w:tcPr/>
+          <w:p>
+            <w:pPr>
+              <w:numPr>
+                <w:ilvl w:val="0"/>
+                <w:numId w:val="1000"/>
+              </w:numPr>
+              <w:pStyle w:val="Compact"/>
+              <w:jc w:val="left"/>
+            </w:pPr>
+            <w:r>
+              <w:rPr>
+                <w:rStyle w:val="VerbatimChar"/>
+              </w:rPr>
+              <w:t xml:space="preserve">Moderate</w:t>
+            </w:r>
+          </w:p>
+        </w:tc>
+        <w:tc>
+          <w:tcPr/>
+          <w:p>
+            <w:pPr>
+              <w:numPr>
+                <w:ilvl w:val="0"/>
+                <w:numId w:val="1000"/>
+              </w:numPr>
+              <w:pStyle w:val="Compact"/>
+              <w:jc w:val="left"/>
+            </w:pPr>
+            <w:r>
+              <w:t xml:space="preserve">Needle</w:t>
+            </w:r>
+          </w:p>
+        </w:tc>
+        <w:tc>
+          <w:tcPr/>
+          <w:p>
+            <w:pPr>
+              <w:numPr>
+                <w:ilvl w:val="0"/>
+                <w:numId w:val="1000"/>
+              </w:numPr>
+              <w:pStyle w:val="Compact"/>
+              <w:jc w:val="left"/>
+            </w:pPr>
+            <w:r>
+              <w:t xml:space="preserve">local LLM</w:t>
+            </w:r>
+          </w:p>
+        </w:tc>
+        <w:tc>
+          <w:tcPr/>
+          <w:p>
+            <w:pPr>
+              <w:numPr>
+                <w:ilvl w:val="0"/>
+                <w:numId w:val="1000"/>
+              </w:numPr>
+              <w:pStyle w:val="Compact"/>
+              <w:jc w:val="left"/>
+            </w:pPr>
+            <w:r>
+              <w:t xml:space="preserve">yes</w:t>
+            </w:r>
+          </w:p>
+        </w:tc>
+      </w:tr>
+      <w:tr>
+        <w:tc>
+          <w:tcPr/>
+          <w:p>
+            <w:pPr>
+              <w:numPr>
+                <w:ilvl w:val="0"/>
+                <w:numId w:val="1000"/>
+              </w:numPr>
+              <w:pStyle w:val="Compact"/>
+              <w:jc w:val="left"/>
+            </w:pPr>
+            <w:r>
+              <w:rPr>
+                <w:rStyle w:val="VerbatimChar"/>
+              </w:rPr>
+              <w:t xml:space="preserve">Complex</w:t>
+            </w:r>
+          </w:p>
+        </w:tc>
+        <w:tc>
+          <w:tcPr/>
+          <w:p>
+            <w:pPr>
+              <w:numPr>
+                <w:ilvl w:val="0"/>
+                <w:numId w:val="1000"/>
+              </w:numPr>
+              <w:pStyle w:val="Compact"/>
+              <w:jc w:val="left"/>
+            </w:pPr>
+            <w:r>
+              <w:t xml:space="preserve">local LLM</w:t>
+            </w:r>
+          </w:p>
+        </w:tc>
+        <w:tc>
+          <w:tcPr/>
+          <w:p>
+            <w:pPr>
+              <w:numPr>
+                <w:ilvl w:val="0"/>
+                <w:numId w:val="1000"/>
+              </w:numPr>
+              <w:pStyle w:val="Compact"/>
+              <w:jc w:val="left"/>
+            </w:pPr>
+            <w:r>
+              <w:t xml:space="preserve">local LLM</w:t>
+            </w:r>
+          </w:p>
+        </w:tc>
+        <w:tc>
+          <w:tcPr/>
+          <w:p>
+            <w:pPr>
+              <w:numPr>
+                <w:ilvl w:val="0"/>
+                <w:numId w:val="1000"/>
+              </w:numPr>
+              <w:pStyle w:val="Compact"/>
+              <w:jc w:val="left"/>
+            </w:pPr>
+            <w:r>
+              <w:t xml:space="preserve">yes</w:t>
+            </w:r>
+          </w:p>
+        </w:tc>
+      </w:tr>
+    </w:tbl>
+    <w:p>
+      <w:pPr>
+        <w:numPr>
+          <w:ilvl w:val="0"/>
+          <w:numId w:val="1001"/>
+        </w:numPr>
+      </w:pPr>
+      <w:r>
+        <w:rPr>
+          <w:bCs/>
+          <w:b/>
+        </w:rPr>
+        <w:t xml:space="preserve">Tool calling.</w:t>
+      </w:r>
+      <w:r>
+        <w:t xml:space="preserve"> </w:t>
+      </w:r>
+      <w:r>
+        <w:t xml:space="preserve">An explicit, visible tool-use loop over the</w:t>
+      </w:r>
+      <w:r>
+        <w:t xml:space="preserve"> </w:t>
+      </w:r>
+      <w:r>
+        <w:rPr>
+          <w:rStyle w:val="VerbatimChar"/>
+        </w:rPr>
+        <w:t xml:space="preserve">graphdb_tool_schemas</w:t>
+      </w:r>
+      <w:r>
+        <w:t xml:space="preserve"> </w:t>
+      </w:r>
+      <w:r>
+        <w:t xml:space="preserve">registry (</w:t>
+      </w:r>
+      <w:r>
+        <w:rPr>
+          <w:rStyle w:val="VerbatimChar"/>
+        </w:rPr>
+        <w:t xml:space="preserve">search_knowledge_base</w:t>
+      </w:r>
+      <w:r>
+        <w:t xml:space="preserve">,</w:t>
+      </w:r>
+      <w:r>
+        <w:t xml:space="preserve"> </w:t>
+      </w:r>
+      <w:r>
+        <w:rPr>
+          <w:rStyle w:val="VerbatimChar"/>
+        </w:rPr>
+        <w:t xml:space="preserve">list_documents</w:t>
+      </w:r>
+      <w:r>
+        <w:t xml:space="preserve">,</w:t>
+      </w:r>
+      <w:r>
+        <w:t xml:space="preserve"> </w:t>
+      </w:r>
+      <w:r>
+        <w:rPr>
+          <w:rStyle w:val="VerbatimChar"/>
+        </w:rPr>
+        <w:t xml:space="preserve">get_document_chunks</w:t>
+      </w:r>
+      <w:r>
+        <w:t xml:space="preserve">). Each turn prints the</w:t>
+      </w:r>
+      <w:r>
+        <w:t xml:space="preserve"> </w:t>
+      </w:r>
+      <w:r>
+        <w:rPr>
+          <w:rStyle w:val="VerbatimChar"/>
+        </w:rPr>
+        <w:t xml:space="preserve">tool_use</w:t>
+      </w:r>
+      <w:r>
+        <w:t xml:space="preserve"> </w:t>
+      </w:r>
+      <w:r>
+        <w:t xml:space="preserve">call and a preview of</w:t>
+      </w:r>
+      <w:r>
+        <w:t xml:space="preserve"> </w:t>
+      </w:r>
+      <w:r>
+        <w:t xml:space="preserve">the</w:t>
+      </w:r>
+      <w:r>
+        <w:t xml:space="preserve"> </w:t>
+      </w:r>
+      <w:r>
+        <w:rPr>
+          <w:rStyle w:val="VerbatimChar"/>
+        </w:rPr>
+        <w:t xml:space="preserve">tool_result</w:t>
+      </w:r>
+      <w:r>
+        <w:t xml:space="preserve">, then composes the answer from it.</w:t>
+      </w:r>
+    </w:p>
+    <w:p>
+      <w:pPr>
+        <w:numPr>
+          <w:ilvl w:val="0"/>
+          <w:numId w:val="1001"/>
+        </w:numPr>
+      </w:pPr>
+      <w:r>
+        <w:rPr>
+          <w:bCs/>
+          <w:b/>
+        </w:rPr>
+        <w:t xml:space="preserve">Skills.</w:t>
+      </w:r>
+      <w:r>
+        <w:t xml:space="preserve"> </w:t>
+      </w:r>
+      <w:r>
+        <w:t xml:space="preserve">Reusable instruction</w:t>
+      </w:r>
+      <w:r>
+        <w:t xml:space="preserve"> </w:t>
+      </w:r>
+      <w:r>
+        <w:t xml:space="preserve">“</w:t>
+      </w:r>
+      <w:r>
+        <w:t xml:space="preserve">folders</w:t>
+      </w:r>
+      <w:r>
+        <w:t xml:space="preserve">”</w:t>
+      </w:r>
+      <w:r>
+        <w:t xml:space="preserve"> </w:t>
+      </w:r>
+      <w:r>
+        <w:t xml:space="preserve">on disk under</w:t>
+      </w:r>
+      <w:r>
+        <w:t xml:space="preserve"> </w:t>
+      </w:r>
+      <w:hyperlink r:id="rId38">
+        <w:r>
+          <w:rPr>
+            <w:rStyle w:val="VerbatimChar"/>
+          </w:rPr>
+          <w:t xml:space="preserve">examples/skills/&lt;name&gt;/SKILL.md</w:t>
+        </w:r>
+      </w:hyperlink>
+      <w:r>
+        <w:t xml:space="preserve">, each with a</w:t>
+      </w:r>
+      <w:r>
+        <w:t xml:space="preserve"> </w:t>
+      </w:r>
+      <w:r>
+        <w:t xml:space="preserve">description, trigger</w:t>
+      </w:r>
+      <w:r>
+        <w:t xml:space="preserve"> </w:t>
+      </w:r>
+      <w:r>
+        <w:rPr>
+          <w:rStyle w:val="VerbatimChar"/>
+        </w:rPr>
+        <w:t xml:space="preserve">cues</w:t>
+      </w:r>
+      <w:r>
+        <w:t xml:space="preserve">, and an instruction body. The best-matching skill</w:t>
+      </w:r>
+      <w:r>
+        <w:t xml:space="preserve"> </w:t>
+      </w:r>
+      <w:r>
+        <w:t xml:space="preserve">for a task is injected into the LLM prompt — the same pattern as Claude Code’s</w:t>
+      </w:r>
+      <w:r>
+        <w:t xml:space="preserve"> </w:t>
+      </w:r>
+      <w:r>
+        <w:t xml:space="preserve">Agent Skills. Add a skill by dropping in a new</w:t>
+      </w:r>
+      <w:r>
+        <w:t xml:space="preserve"> </w:t>
+      </w:r>
+      <w:r>
+        <w:rPr>
+          <w:rStyle w:val="VerbatimChar"/>
+        </w:rPr>
+        <w:t xml:space="preserve">SKILL.md</w:t>
+      </w:r>
+      <w:r>
+        <w:t xml:space="preserve">; no code changes.</w:t>
+      </w:r>
+    </w:p>
+    <w:p>
+      <w:pPr>
+        <w:pStyle w:val="SourceCode"/>
+      </w:pPr>
+      <w:r>
+        <w:rPr>
+          <w:rStyle w:val="CommentTok"/>
+        </w:rPr>
+        <w:t xml:space="preserve"># fully offline (deterministic Needle + stub LLM):</w:t>
+      </w:r>
+      <w:r>
+        <w:br/>
+      </w:r>
+      <w:r>
+        <w:rPr>
+          <w:rStyle w:val="ExtensionTok"/>
+        </w:rPr>
+        <w:t xml:space="preserve">cargo</w:t>
+      </w:r>
+      <w:r>
+        <w:rPr>
+          <w:rStyle w:val="NormalTok"/>
+        </w:rPr>
+        <w:t xml:space="preserve"> run </w:t>
+      </w:r>
+      <w:r>
+        <w:rPr>
+          <w:rStyle w:val="AttributeTok"/>
+        </w:rPr>
+        <w:t xml:space="preserve">-p</w:t>
+      </w:r>
+      <w:r>
+        <w:rPr>
+          <w:rStyle w:val="NormalTok"/>
+        </w:rPr>
+        <w:t xml:space="preserve"> model-hub </w:t>
+      </w:r>
+      <w:r>
+        <w:rPr>
+          <w:rStyle w:val="AttributeTok"/>
+        </w:rPr>
+        <w:t xml:space="preserve">--example</w:t>
+      </w:r>
+      <w:r>
+        <w:rPr>
+          <w:rStyle w:val="NormalTok"/>
+        </w:rPr>
+        <w:t xml:space="preserve"> claude_code_agent</w:t>
+      </w:r>
+      <w:r>
+        <w:br/>
+      </w:r>
+      <w:r>
+        <w:br/>
+      </w:r>
+      <w:r>
+        <w:rPr>
+          <w:rStyle w:val="CommentTok"/>
+        </w:rPr>
+        <w:t xml:space="preserve"># with a real local model (quantized Llama GGUF):</w:t>
+      </w:r>
+      <w:r>
+        <w:br/>
+      </w:r>
+      <w:r>
+        <w:rPr>
+          <w:rStyle w:val="VariableTok"/>
+        </w:rPr>
+        <w:t xml:space="preserve">GRAPHDB_MODEL</w:t>
+      </w:r>
+      <w:r>
+        <w:rPr>
+          <w:rStyle w:val="OperatorTok"/>
+        </w:rPr>
+        <w:t xml:space="preserve">=</w:t>
+      </w:r>
+      <w:r>
+        <w:rPr>
+          <w:rStyle w:val="NormalTok"/>
+        </w:rPr>
+        <w:t xml:space="preserve">/path/to/model.gguf </w:t>
+      </w:r>
+      <w:r>
+        <w:rPr>
+          <w:rStyle w:val="DataTypeTok"/>
+        </w:rPr>
+        <w:t xml:space="preserve">\</w:t>
+      </w:r>
+      <w:r>
+        <w:br/>
+      </w:r>
+      <w:r>
+        <w:rPr>
+          <w:rStyle w:val="VariableTok"/>
+        </w:rPr>
+        <w:t xml:space="preserve">GRAPHDB_TOKENIZER</w:t>
+      </w:r>
+      <w:r>
+        <w:rPr>
+          <w:rStyle w:val="OperatorTok"/>
+        </w:rPr>
+        <w:t xml:space="preserve">=</w:t>
+      </w:r>
+      <w:r>
+        <w:rPr>
+          <w:rStyle w:val="NormalTok"/>
+        </w:rPr>
+        <w:t xml:space="preserve">/path/to/tokenizer.json </w:t>
+      </w:r>
+      <w:r>
+        <w:rPr>
+          <w:rStyle w:val="DataTypeTok"/>
+        </w:rPr>
+        <w:t xml:space="preserve">\</w:t>
+      </w:r>
+      <w:r>
+        <w:br/>
+      </w:r>
+      <w:r>
+        <w:rPr>
+          <w:rStyle w:val="ExtensionTok"/>
+        </w:rPr>
+        <w:t xml:space="preserve">cargo</w:t>
+      </w:r>
+      <w:r>
+        <w:rPr>
+          <w:rStyle w:val="NormalTok"/>
+        </w:rPr>
+        <w:t xml:space="preserve"> run </w:t>
+      </w:r>
+      <w:r>
+        <w:rPr>
+          <w:rStyle w:val="AttributeTok"/>
+        </w:rPr>
+        <w:t xml:space="preserve">-p</w:t>
+      </w:r>
+      <w:r>
+        <w:rPr>
+          <w:rStyle w:val="NormalTok"/>
+        </w:rPr>
+        <w:t xml:space="preserve"> model-hub </w:t>
+      </w:r>
+      <w:r>
+        <w:rPr>
+          <w:rStyle w:val="AttributeTok"/>
+        </w:rPr>
+        <w:t xml:space="preserve">--example</w:t>
+      </w:r>
+      <w:r>
+        <w:rPr>
+          <w:rStyle w:val="NormalTok"/>
+        </w:rPr>
+        <w:t xml:space="preserve"> claude_code_agent</w:t>
+      </w:r>
+    </w:p>
+    <w:p>
+      <w:pPr>
+        <w:pStyle w:val="BlockText"/>
+      </w:pPr>
+      <w:r>
+        <w:t xml:space="preserve">With the default offline stub the LLM tiers emit placeholder prose (tool</w:t>
+      </w:r>
+      <w:r>
+        <w:t xml:space="preserve"> </w:t>
+      </w:r>
+      <w:r>
+        <w:t xml:space="preserve">results are still real); plug in a GGUF via the two env vars for real answers</w:t>
+      </w:r>
+      <w:r>
+        <w:t xml:space="preserve"> </w:t>
+      </w:r>
+      <w:r>
+        <w:t xml:space="preserve">on the Moderate/Complex tiers.</w:t>
       </w:r>
     </w:p>
     <w:p>
@@ -2302,8 +3204,8 @@
         </w:pict>
       </w:r>
     </w:p>
-    <w:bookmarkEnd w:id="36"/>
-    <w:bookmarkStart w:id="37" w:name="gpu-real-models"/>
+    <w:bookmarkEnd w:id="39"/>
+    <w:bookmarkStart w:id="40" w:name="gpu-real-models"/>
     <w:p>
       <w:pPr>
         <w:pStyle w:val="Heading2"/>
@@ -2478,8 +3380,8 @@
         <w:t xml:space="preserve">snippet.</w:t>
       </w:r>
     </w:p>
-    <w:bookmarkEnd w:id="37"/>
-    <w:bookmarkEnd w:id="38"/>
+    <w:bookmarkEnd w:id="40"/>
+    <w:bookmarkEnd w:id="41"/>
     <w:sectPr/>
   </w:body>
 </w:document>
@@ -2586,8 +3488,123 @@
       </w:pPr>
     </w:lvl>
   </w:abstractNum>
+  <w:abstractNum w:abstractNumId="99411">
+    <w:nsid w:val="A99411"/>
+    <w:multiLevelType w:val="multilevel"/>
+    <w:lvl w:ilvl="0">
+      <w:start w:val="1"/>
+      <w:numFmt w:val="decimal"/>
+      <w:lvlText w:val="%1."/>
+      <w:lvlJc w:val="left"/>
+      <w:pPr>
+        <w:ind w:left="720" w:hanging="480"/>
+      </w:pPr>
+    </w:lvl>
+    <w:lvl w:ilvl="1">
+      <w:start w:val="1"/>
+      <w:numFmt w:val="decimal"/>
+      <w:lvlText w:val="%2."/>
+      <w:lvlJc w:val="left"/>
+      <w:pPr>
+        <w:ind w:left="1440" w:hanging="480"/>
+      </w:pPr>
+    </w:lvl>
+    <w:lvl w:ilvl="2">
+      <w:start w:val="1"/>
+      <w:numFmt w:val="decimal"/>
+      <w:lvlText w:val="%3."/>
+      <w:lvlJc w:val="left"/>
+      <w:pPr>
+        <w:ind w:left="2160" w:hanging="480"/>
+      </w:pPr>
+    </w:lvl>
+    <w:lvl w:ilvl="3">
+      <w:start w:val="1"/>
+      <w:numFmt w:val="decimal"/>
+      <w:lvlText w:val="%4."/>
+      <w:lvlJc w:val="left"/>
+      <w:pPr>
+        <w:ind w:left="2880" w:hanging="480"/>
+      </w:pPr>
+    </w:lvl>
+    <w:lvl w:ilvl="4">
+      <w:start w:val="1"/>
+      <w:numFmt w:val="decimal"/>
+      <w:lvlText w:val="%5."/>
+      <w:lvlJc w:val="left"/>
+      <w:pPr>
+        <w:ind w:left="3600" w:hanging="480"/>
+      </w:pPr>
+    </w:lvl>
+    <w:lvl w:ilvl="5">
+      <w:start w:val="1"/>
+      <w:numFmt w:val="decimal"/>
+      <w:lvlText w:val="%6."/>
+      <w:lvlJc w:val="left"/>
+      <w:pPr>
+        <w:ind w:left="4320" w:hanging="480"/>
+      </w:pPr>
+    </w:lvl>
+    <w:lvl w:ilvl="6">
+      <w:start w:val="1"/>
+      <w:numFmt w:val="decimal"/>
+      <w:lvlText w:val="%7."/>
+      <w:lvlJc w:val="left"/>
+      <w:pPr>
+        <w:ind w:left="5040" w:hanging="480"/>
+      </w:pPr>
+    </w:lvl>
+    <w:lvl w:ilvl="7">
+      <w:start w:val="1"/>
+      <w:numFmt w:val="decimal"/>
+      <w:lvlText w:val="%8."/>
+      <w:lvlJc w:val="left"/>
+      <w:pPr>
+        <w:ind w:left="5760" w:hanging="480"/>
+      </w:pPr>
+    </w:lvl>
+    <w:lvl w:ilvl="8">
+      <w:start w:val="1"/>
+      <w:numFmt w:val="decimal"/>
+      <w:lvlText w:val="%9."/>
+      <w:lvlJc w:val="left"/>
+      <w:pPr>
+        <w:ind w:left="6480" w:hanging="480"/>
+      </w:pPr>
+    </w:lvl>
+  </w:abstractNum>
   <w:num w:numId="1000">
     <w:abstractNumId w:val="990"/>
+  </w:num>
+  <w:num w:numId="1001">
+    <w:abstractNumId w:val="99411"/>
+    <w:lvlOverride w:ilvl="0">
+      <w:startOverride w:val="1"/>
+    </w:lvlOverride>
+    <w:lvlOverride w:ilvl="1">
+      <w:startOverride w:val="1"/>
+    </w:lvlOverride>
+    <w:lvlOverride w:ilvl="2">
+      <w:startOverride w:val="1"/>
+    </w:lvlOverride>
+    <w:lvlOverride w:ilvl="3">
+      <w:startOverride w:val="1"/>
+    </w:lvlOverride>
+    <w:lvlOverride w:ilvl="4">
+      <w:startOverride w:val="1"/>
+    </w:lvlOverride>
+    <w:lvlOverride w:ilvl="5">
+      <w:startOverride w:val="1"/>
+    </w:lvlOverride>
+    <w:lvlOverride w:ilvl="6">
+      <w:startOverride w:val="1"/>
+    </w:lvlOverride>
+    <w:lvlOverride w:ilvl="7">
+      <w:startOverride w:val="1"/>
+    </w:lvlOverride>
+    <w:lvlOverride w:ilvl="8">
+      <w:startOverride w:val="1"/>
+    </w:lvlOverride>
   </w:num>
 </w:numbering>
 </file>

</xml_diff>